<commit_message>
Correct IELTS to 6.5 in the Japanese documents
The 職務経歴書 still read 6.0 in both the certification list and the English
language level. The 履歴書 and 業務経歴書 spreadsheets are updated on disk too;
they stay untracked, since they carry a home address and an ID photo.

英検準1級 is kept in the Japanese documents. The English resumes dropped the
EIKEN suffix because it means little to a non-Japanese reader, but the
qualification is recognised domestically.

Co-Authored-By: Claude Opus 5 <noreply@anthropic.com>
</commit_message>
<xml_diff>
--- a/cv-form/Shokumu-Keirekisho_NWENWE_WINTHAN_2026.docx
+++ b/cv-form/Shokumu-Keirekisho_NWENWE_WINTHAN_2026.docx
@@ -35,7 +35,7 @@
       <w:pPr>
         <w:spacing w:before="80" w:after="120"/>
         <w:pBdr>
-          <w:bottom w:val="single" w:sz="6" w:color="1F3A5F"/>
+          <w:bottom w:val="single" w:sz="6" w:color="14365C"/>
         </w:pBdr>
       </w:pPr>
     </w:p>
@@ -44,7 +44,7 @@
         <w:keepNext/>
         <w:spacing w:before="200" w:after="60"/>
         <w:pBdr>
-          <w:bottom w:val="single" w:sz="6" w:color="1F3A5F"/>
+          <w:bottom w:val="single" w:sz="6" w:color="14365C"/>
         </w:pBdr>
       </w:pPr>
       <w:r>
@@ -101,7 +101,7 @@
       <w:pPr>
         <w:spacing w:before="80" w:after="120"/>
         <w:pBdr>
-          <w:bottom w:val="single" w:sz="6" w:color="1F3A5F"/>
+          <w:bottom w:val="single" w:sz="6" w:color="14365C"/>
         </w:pBdr>
       </w:pPr>
     </w:p>
@@ -110,7 +110,7 @@
         <w:keepNext/>
         <w:spacing w:before="200" w:after="60"/>
         <w:pBdr>
-          <w:bottom w:val="single" w:sz="6" w:color="1F3A5F"/>
+          <w:bottom w:val="single" w:sz="6" w:color="14365C"/>
         </w:pBdr>
       </w:pPr>
       <w:r>
@@ -533,7 +533,7 @@
       <w:pPr>
         <w:spacing w:before="80" w:after="120"/>
         <w:pBdr>
-          <w:bottom w:val="single" w:sz="6" w:color="1F3A5F"/>
+          <w:bottom w:val="single" w:sz="6" w:color="14365C"/>
         </w:pBdr>
       </w:pPr>
     </w:p>
@@ -542,7 +542,7 @@
         <w:keepNext/>
         <w:spacing w:before="200" w:after="60"/>
         <w:pBdr>
-          <w:bottom w:val="single" w:sz="6" w:color="1F3A5F"/>
+          <w:bottom w:val="single" w:sz="6" w:color="14365C"/>
         </w:pBdr>
       </w:pPr>
       <w:r>
@@ -1555,7 +1555,7 @@
       <w:pPr>
         <w:spacing w:before="80" w:after="120"/>
         <w:pBdr>
-          <w:bottom w:val="single" w:sz="6" w:color="1F3A5F"/>
+          <w:bottom w:val="single" w:sz="6" w:color="14365C"/>
         </w:pBdr>
       </w:pPr>
     </w:p>
@@ -2570,7 +2570,7 @@
       <w:pPr>
         <w:spacing w:before="80" w:after="120"/>
         <w:pBdr>
-          <w:bottom w:val="single" w:sz="6" w:color="1F3A5F"/>
+          <w:bottom w:val="single" w:sz="6" w:color="14365C"/>
         </w:pBdr>
       </w:pPr>
     </w:p>
@@ -4023,7 +4023,7 @@
       <w:pPr>
         <w:spacing w:before="80" w:after="120"/>
         <w:pBdr>
-          <w:bottom w:val="single" w:sz="6" w:color="1F3A5F"/>
+          <w:bottom w:val="single" w:sz="6" w:color="14365C"/>
         </w:pBdr>
       </w:pPr>
     </w:p>
@@ -4555,7 +4555,7 @@
       <w:pPr>
         <w:spacing w:before="80" w:after="120"/>
         <w:pBdr>
-          <w:bottom w:val="single" w:sz="6" w:color="1F3A5F"/>
+          <w:bottom w:val="single" w:sz="6" w:color="14365C"/>
         </w:pBdr>
       </w:pPr>
     </w:p>
@@ -4564,7 +4564,7 @@
         <w:keepNext/>
         <w:spacing w:before="200" w:after="60"/>
         <w:pBdr>
-          <w:bottom w:val="single" w:sz="6" w:color="1F3A5F"/>
+          <w:bottom w:val="single" w:sz="6" w:color="14365C"/>
         </w:pBdr>
       </w:pPr>
       <w:r>
@@ -4875,7 +4875,7 @@
       <w:pPr>
         <w:spacing w:before="80" w:after="120"/>
         <w:pBdr>
-          <w:bottom w:val="single" w:sz="6" w:color="1F3A5F"/>
+          <w:bottom w:val="single" w:sz="6" w:color="14365C"/>
         </w:pBdr>
       </w:pPr>
     </w:p>
@@ -4884,7 +4884,7 @@
         <w:keepNext/>
         <w:spacing w:before="200" w:after="60"/>
         <w:pBdr>
-          <w:bottom w:val="single" w:sz="6" w:color="1F3A5F"/>
+          <w:bottom w:val="single" w:sz="6" w:color="14365C"/>
         </w:pBdr>
       </w:pPr>
       <w:r>
@@ -7251,7 +7251,7 @@
       <w:pPr>
         <w:spacing w:before="80" w:after="120"/>
         <w:pBdr>
-          <w:bottom w:val="single" w:sz="6" w:color="1F3A5F"/>
+          <w:bottom w:val="single" w:sz="6" w:color="14365C"/>
         </w:pBdr>
       </w:pPr>
     </w:p>
@@ -7260,7 +7260,7 @@
         <w:keepNext/>
         <w:spacing w:before="200" w:after="60"/>
         <w:pBdr>
-          <w:bottom w:val="single" w:sz="6" w:color="1F3A5F"/>
+          <w:bottom w:val="single" w:sz="6" w:color="14365C"/>
         </w:pBdr>
       </w:pPr>
       <w:r>
@@ -7444,7 +7444,7 @@
           <w:b/>
           <w:i w:val="0"/>
         </w:rPr>
-        <w:t>IELTS 6.0／英検準1級</w:t>
+        <w:t>IELTS 6.5／英検準1級</w:t>
       </w:r>
       <w:r>
         <w:rPr>
@@ -7644,7 +7644,7 @@
                 <w:i w:val="0"/>
                 <w:sz w:val="18"/>
               </w:rPr>
-              <w:t>ビジネスレベル（TOEIC 710点、IELTS 6.0）</w:t>
+              <w:t>ビジネスレベル（TOEIC 710点、IELTS 6.5）</w:t>
             </w:r>
           </w:p>
         </w:tc>
@@ -7745,7 +7745,7 @@
       <w:pPr>
         <w:spacing w:before="80" w:after="120"/>
         <w:pBdr>
-          <w:bottom w:val="single" w:sz="6" w:color="1F3A5F"/>
+          <w:bottom w:val="single" w:sz="6" w:color="14365C"/>
         </w:pBdr>
       </w:pPr>
     </w:p>
@@ -7754,7 +7754,7 @@
         <w:keepNext/>
         <w:spacing w:before="200" w:after="60"/>
         <w:pBdr>
-          <w:bottom w:val="single" w:sz="6" w:color="1F3A5F"/>
+          <w:bottom w:val="single" w:sz="6" w:color="14365C"/>
         </w:pBdr>
       </w:pPr>
       <w:r>
@@ -7931,7 +7931,7 @@
       <w:pPr>
         <w:spacing w:before="80" w:after="120"/>
         <w:pBdr>
-          <w:bottom w:val="single" w:sz="6" w:color="1F3A5F"/>
+          <w:bottom w:val="single" w:sz="6" w:color="14365C"/>
         </w:pBdr>
       </w:pPr>
     </w:p>
@@ -7940,7 +7940,7 @@
         <w:keepNext/>
         <w:spacing w:before="200" w:after="60"/>
         <w:pBdr>
-          <w:bottom w:val="single" w:sz="6" w:color="1F3A5F"/>
+          <w:bottom w:val="single" w:sz="6" w:color="14365C"/>
         </w:pBdr>
       </w:pPr>
       <w:r>

</xml_diff>